<commit_message>
test: take Word re-saves of the corpus as a third author
corpus/word/ holds each document saved again by Word — rsids,
proofErr, separator notes, theme docDefaults — asserted to read like
the docx-lib original and survive our round trip. The formula fixture
is reauthored: a hand-wrapped MathNumerator doubled m:num/m:den, which
Word refuses to open, and the radical gets a visible degree.
</commit_message>
<xml_diff>
--- a/tests/corpus/14-formulas.docx
+++ b/tests/corpus/14-formulas.docx
@@ -9,18 +9,14 @@
       <m:oMath>
         <m:f>
           <m:num>
-            <m:num>
-              <m:r>
-                <m:t>a</m:t>
-              </m:r>
-            </m:num>
+            <m:r>
+              <m:t>a</m:t>
+            </m:r>
           </m:num>
           <m:den>
-            <m:den>
-              <m:r>
-                <m:t>b</m:t>
-              </m:r>
-            </m:den>
+            <m:r>
+              <m:t>b</m:t>
+            </m:r>
           </m:den>
         </m:f>
       </m:oMath>
@@ -32,7 +28,11 @@
       <m:oMath>
         <m:rad>
           <m:radPr/>
-          <m:deg/>
+          <m:deg>
+            <m:r>
+              <m:t>3</m:t>
+            </m:r>
+          </m:deg>
           <m:e>
             <m:r>
               <m:t>x</m:t>

</xml_diff>